<commit_message>
expose Account Service port for local diagnostics
Publish port 8081 from the Account Service container so its health, metrics, and Swagger endpoints can be accessed directly from the host during local development and testing.
</commit_message>
<xml_diff>
--- a/docs/Design.docx
+++ b/docs/Design.docx
@@ -1045,6 +1045,114 @@
     </w:p>
     <w:p>
       <w:pPr>
+        <w:pStyle w:val="Heading2"/>
+      </w:pPr>
+      <w:r>
+        <w:t>5.1 Database Technology Decision: File-Based SQLite</w:t>
+      </w:r>
+    </w:p>
+    <w:p>
+      <w:r>
+        <w:t>Each microservice uses its own file-based SQLite database rather than an in-memory database. This choice satisfies the exercise requirement for an embedded database while preserving data across normal process and container restarts.</w:t>
+      </w:r>
+    </w:p>
+    <w:p>
+      <w:pPr>
+        <w:pStyle w:val="Heading3"/>
+      </w:pPr>
+      <w:r>
+        <w:t>Rationale</w:t>
+      </w:r>
+    </w:p>
+    <w:p>
+      <w:pPr>
+        <w:pStyle w:val="ListBullet"/>
+      </w:pPr>
+      <w:r>
+        <w:t>Restart persistence: event records, account transactions, and balances remain available after a service or container restarts.</w:t>
+      </w:r>
+    </w:p>
+    <w:p>
+      <w:pPr>
+        <w:pStyle w:val="ListBullet"/>
+      </w:pPr>
+      <w:r>
+        <w:t>Operational realism: persistence behavior is closer to a production service than an in-memory database, making recovery and idempotency demonstrations more meaningful.</w:t>
+      </w:r>
+    </w:p>
+    <w:p>
+      <w:pPr>
+        <w:pStyle w:val="ListBullet"/>
+      </w:pPr>
+      <w:r>
+        <w:t>Low setup cost: SQLite is embedded and requires no separate database server, credentials, or additional infrastructure.</w:t>
+      </w:r>
+    </w:p>
+    <w:p>
+      <w:pPr>
+        <w:pStyle w:val="ListBullet"/>
+      </w:pPr>
+      <w:r>
+        <w:t>Service isolation: the Gateway and Account Service retain separate database files and do not share tables or state.</w:t>
+      </w:r>
+    </w:p>
+    <w:p>
+      <w:pPr>
+        <w:pStyle w:val="ListBullet"/>
+      </w:pPr>
+      <w:r>
+        <w:t>Deterministic review: a reviewer can restart the stack and verify that previously submitted events and balances remain present.</w:t>
+      </w:r>
+    </w:p>
+    <w:p>
+      <w:pPr>
+        <w:pStyle w:val="ListBullet"/>
+      </w:pPr>
+      <w:r>
+        <w:t>Docker compatibility: named volumes can store each SQLite file outside the container writable layer, allowing docker compose down/up without data loss.</w:t>
+      </w:r>
+    </w:p>
+    <w:p>
+      <w:pPr>
+        <w:pStyle w:val="Heading3"/>
+      </w:pPr>
+      <w:r>
+        <w:t>Why Not an In-Memory Database?</w:t>
+      </w:r>
+    </w:p>
+    <w:p>
+      <w:r>
+        <w:t>An in-memory database would also satisfy the assignment, but all data would be lost whenever a process exits. That would make restart behavior less realistic and could obscure whether idempotency and account state remain correct after recovery. In-memory databases remain useful for isolated unit tests where speed and automatic cleanup are more important than persistence.</w:t>
+      </w:r>
+    </w:p>
+    <w:p>
+      <w:pPr>
+        <w:pStyle w:val="Heading3"/>
+      </w:pPr>
+      <w:r>
+        <w:t>Persistence and Reset Behavior</w:t>
+      </w:r>
+    </w:p>
+    <w:p>
+      <w:r>
+        <w:t>In Docker Compose, the Gateway database is stored in a gateway-data volume and the Account Service database is stored in an account-data volume. Stopping or recreating containers preserves these named volumes. Running docker compose down -v intentionally removes the volumes and resets all application data.</w:t>
+      </w:r>
+    </w:p>
+    <w:p>
+      <w:pPr>
+        <w:pStyle w:val="Heading3"/>
+      </w:pPr>
+      <w:r>
+        <w:t>Limitations and Production Positioning</w:t>
+      </w:r>
+    </w:p>
+    <w:p>
+      <w:r>
+        <w:t>SQLite is appropriate for this bounded take-home exercise, but it is not the recommended production database for a horizontally scaled, high-concurrency financial platform. A production deployment would typically use a managed relational database such as PostgreSQL for stronger concurrent-write behavior, backups, replication, failover, access controls, and operational tooling. The repository and service layers keep this replacement localized.</w:t>
+      </w:r>
+    </w:p>
+    <w:p>
+      <w:pPr>
         <w:jc w:val="center"/>
       </w:pPr>
       <w:r>
@@ -1060,7 +1168,7 @@
         <w:pStyle w:val="Heading2"/>
       </w:pPr>
       <w:r>
-        <w:t>5.1 Gateway Event Record</w:t>
+        <w:t>5.2 Gateway Event Record</w:t>
       </w:r>
     </w:p>
     <w:tbl>
@@ -1453,7 +1561,7 @@
         <w:pStyle w:val="Heading2"/>
       </w:pPr>
       <w:r>
-        <w:t>5.2 Account and Transaction Records</w:t>
+        <w:t>5.3 Account and Transaction Records</w:t>
       </w:r>
     </w:p>
     <w:tbl>
@@ -1590,7 +1698,7 @@
         <w:pStyle w:val="Heading2"/>
       </w:pPr>
       <w:r>
-        <w:t>5.3 Transaction Boundary</w:t>
+        <w:t>5.4 Transaction Boundary</w:t>
       </w:r>
     </w:p>
     <w:p>

</xml_diff>